<commit_message>
fix: complete AI-Startklar trainer guide
</commit_message>
<xml_diff>
--- a/deliverables/ai-startklar/schulung/07-trainerleitfaden.docx
+++ b/deliverables/ai-startklar/schulung/07-trainerleitfaden.docx
@@ -1990,6 +1990,7 @@
     <w:p>
       <w:pPr>
         <w:pStyle w:val="MHChecklist"/>
+        <w:keepNext/>
         <w:numPr>
           <w:ilvl w:val="0"/>
           <w:numId w:val="11"/>
@@ -2008,6 +2009,7 @@
     <w:p>
       <w:pPr>
         <w:pStyle w:val="MHChecklist"/>
+        <w:keepNext/>
         <w:numPr>
           <w:ilvl w:val="0"/>
           <w:numId w:val="11"/>
@@ -2026,6 +2028,7 @@
     <w:p>
       <w:pPr>
         <w:pStyle w:val="MHChecklist"/>
+        <w:keepNext/>
         <w:numPr>
           <w:ilvl w:val="0"/>
           <w:numId w:val="11"/>
@@ -2044,6 +2047,7 @@
     <w:p>
       <w:pPr>
         <w:pStyle w:val="MHChecklist"/>
+        <w:keepNext/>
         <w:numPr>
           <w:ilvl w:val="0"/>
           <w:numId w:val="11"/>
@@ -2062,6 +2066,7 @@
     <w:p>
       <w:pPr>
         <w:pStyle w:val="MHChecklist"/>
+        <w:keepNext w:val="0"/>
         <w:numPr>
           <w:ilvl w:val="0"/>
           <w:numId w:val="11"/>
@@ -2467,6 +2472,7 @@
     <w:p>
       <w:pPr>
         <w:pStyle w:val="MHChecklist"/>
+        <w:keepNext/>
         <w:numPr>
           <w:ilvl w:val="0"/>
           <w:numId w:val="12"/>
@@ -2485,6 +2491,7 @@
     <w:p>
       <w:pPr>
         <w:pStyle w:val="MHChecklist"/>
+        <w:keepNext/>
         <w:numPr>
           <w:ilvl w:val="0"/>
           <w:numId w:val="12"/>
@@ -2503,6 +2510,7 @@
     <w:p>
       <w:pPr>
         <w:pStyle w:val="MHChecklist"/>
+        <w:keepNext/>
         <w:numPr>
           <w:ilvl w:val="0"/>
           <w:numId w:val="12"/>
@@ -2521,6 +2529,7 @@
     <w:p>
       <w:pPr>
         <w:pStyle w:val="MHChecklist"/>
+        <w:keepNext w:val="0"/>
         <w:numPr>
           <w:ilvl w:val="0"/>
           <w:numId w:val="12"/>
@@ -2926,6 +2935,7 @@
     <w:p>
       <w:pPr>
         <w:pStyle w:val="MHChecklist"/>
+        <w:keepNext/>
         <w:numPr>
           <w:ilvl w:val="0"/>
           <w:numId w:val="13"/>
@@ -2944,6 +2954,7 @@
     <w:p>
       <w:pPr>
         <w:pStyle w:val="MHChecklist"/>
+        <w:keepNext/>
         <w:numPr>
           <w:ilvl w:val="0"/>
           <w:numId w:val="13"/>
@@ -2962,6 +2973,7 @@
     <w:p>
       <w:pPr>
         <w:pStyle w:val="MHChecklist"/>
+        <w:keepNext/>
         <w:numPr>
           <w:ilvl w:val="0"/>
           <w:numId w:val="13"/>
@@ -2980,6 +2992,7 @@
     <w:p>
       <w:pPr>
         <w:pStyle w:val="MHChecklist"/>
+        <w:keepNext/>
         <w:numPr>
           <w:ilvl w:val="0"/>
           <w:numId w:val="13"/>
@@ -2998,6 +3011,7 @@
     <w:p>
       <w:pPr>
         <w:pStyle w:val="MHChecklist"/>
+        <w:keepNext w:val="0"/>
         <w:numPr>
           <w:ilvl w:val="0"/>
           <w:numId w:val="13"/>
@@ -3493,6 +3507,7 @@
     <w:p>
       <w:pPr>
         <w:pStyle w:val="MHChecklist"/>
+        <w:keepNext/>
         <w:numPr>
           <w:ilvl w:val="0"/>
           <w:numId w:val="14"/>
@@ -3511,6 +3526,7 @@
     <w:p>
       <w:pPr>
         <w:pStyle w:val="MHChecklist"/>
+        <w:keepNext/>
         <w:numPr>
           <w:ilvl w:val="0"/>
           <w:numId w:val="14"/>
@@ -3529,6 +3545,7 @@
     <w:p>
       <w:pPr>
         <w:pStyle w:val="MHChecklist"/>
+        <w:keepNext/>
         <w:numPr>
           <w:ilvl w:val="0"/>
           <w:numId w:val="14"/>
@@ -3547,6 +3564,7 @@
     <w:p>
       <w:pPr>
         <w:pStyle w:val="MHChecklist"/>
+        <w:keepNext/>
         <w:numPr>
           <w:ilvl w:val="0"/>
           <w:numId w:val="14"/>
@@ -3565,6 +3583,7 @@
     <w:p>
       <w:pPr>
         <w:pStyle w:val="MHChecklist"/>
+        <w:keepNext w:val="0"/>
         <w:numPr>
           <w:ilvl w:val="0"/>
           <w:numId w:val="14"/>
@@ -4117,6 +4136,7 @@
     <w:p>
       <w:pPr>
         <w:pStyle w:val="MHChecklist"/>
+        <w:keepNext/>
         <w:numPr>
           <w:ilvl w:val="0"/>
           <w:numId w:val="16"/>
@@ -4135,6 +4155,7 @@
     <w:p>
       <w:pPr>
         <w:pStyle w:val="MHChecklist"/>
+        <w:keepNext/>
         <w:numPr>
           <w:ilvl w:val="0"/>
           <w:numId w:val="16"/>
@@ -4153,6 +4174,7 @@
     <w:p>
       <w:pPr>
         <w:pStyle w:val="MHChecklist"/>
+        <w:keepNext/>
         <w:numPr>
           <w:ilvl w:val="0"/>
           <w:numId w:val="16"/>
@@ -4171,6 +4193,7 @@
     <w:p>
       <w:pPr>
         <w:pStyle w:val="MHChecklist"/>
+        <w:keepNext/>
         <w:numPr>
           <w:ilvl w:val="0"/>
           <w:numId w:val="16"/>
@@ -4189,6 +4212,7 @@
     <w:p>
       <w:pPr>
         <w:pStyle w:val="MHChecklist"/>
+        <w:keepNext/>
         <w:numPr>
           <w:ilvl w:val="0"/>
           <w:numId w:val="16"/>
@@ -4207,6 +4231,7 @@
     <w:p>
       <w:pPr>
         <w:pStyle w:val="MHChecklist"/>
+        <w:keepNext w:val="0"/>
         <w:numPr>
           <w:ilvl w:val="0"/>
           <w:numId w:val="16"/>
@@ -4612,6 +4637,7 @@
     <w:p>
       <w:pPr>
         <w:pStyle w:val="MHChecklist"/>
+        <w:keepNext/>
         <w:numPr>
           <w:ilvl w:val="0"/>
           <w:numId w:val="17"/>
@@ -4630,6 +4656,7 @@
     <w:p>
       <w:pPr>
         <w:pStyle w:val="MHChecklist"/>
+        <w:keepNext/>
         <w:numPr>
           <w:ilvl w:val="0"/>
           <w:numId w:val="17"/>
@@ -4648,6 +4675,7 @@
     <w:p>
       <w:pPr>
         <w:pStyle w:val="MHChecklist"/>
+        <w:keepNext/>
         <w:numPr>
           <w:ilvl w:val="0"/>
           <w:numId w:val="17"/>
@@ -4666,6 +4694,7 @@
     <w:p>
       <w:pPr>
         <w:pStyle w:val="MHChecklist"/>
+        <w:keepNext/>
         <w:numPr>
           <w:ilvl w:val="0"/>
           <w:numId w:val="17"/>
@@ -4684,6 +4713,7 @@
     <w:p>
       <w:pPr>
         <w:pStyle w:val="MHChecklist"/>
+        <w:keepNext w:val="0"/>
         <w:numPr>
           <w:ilvl w:val="0"/>
           <w:numId w:val="17"/>
@@ -5459,6 +5489,388 @@
     </w:p>
     <w:p>
       <w:pPr>
+        <w:pStyle w:val="Heading2"/>
+        <w:pageBreakBefore/>
+      </w:pPr>
+      <w:r>
+        <w:t>Zehn Lern- und Transferfragen mit Kurzlösung</w:t>
+      </w:r>
+    </w:p>
+    <w:p>
+      <w:pPr>
+        <w:pStyle w:val="MHChecklist"/>
+        <w:numPr>
+          <w:ilvl w:val="0"/>
+          <w:numId w:val="18"/>
+        </w:numPr>
+      </w:pPr>
+      <w:r>
+        <w:rPr>
+          <w:rFonts w:ascii="Calibri" w:hAnsi="Calibri"/>
+          <w:b/>
+          <w:color w:val="1F2A2A"/>
+          <w:sz w:val="19"/>
+        </w:rPr>
+        <w:t>Warum kann eine überzeugende Antwort falsch sein?</w:t>
+      </w:r>
+      <w:r>
+        <w:rPr>
+          <w:rFonts w:ascii="Calibri" w:hAnsi="Calibri"/>
+          <w:b w:val="0"/>
+          <w:color w:val="1F2A2A"/>
+          <w:sz w:val="19"/>
+        </w:rPr>
+        <w:t xml:space="preserve"> – Weil das Modell wahrscheinliche Sprache erzeugt und Wahrheit, Aktualität oder Vollständigkeit nicht automatisch sicherstellt.</w:t>
+      </w:r>
+    </w:p>
+    <w:p>
+      <w:pPr>
+        <w:pStyle w:val="MHChecklist"/>
+        <w:numPr>
+          <w:ilvl w:val="0"/>
+          <w:numId w:val="18"/>
+        </w:numPr>
+      </w:pPr>
+      <w:r>
+        <w:rPr>
+          <w:rFonts w:ascii="Calibri" w:hAnsi="Calibri"/>
+          <w:b/>
+          <w:color w:val="1F2A2A"/>
+          <w:sz w:val="19"/>
+        </w:rPr>
+        <w:t>Welche sechs Bestandteile hat der Prompt?</w:t>
+      </w:r>
+      <w:r>
+        <w:rPr>
+          <w:rFonts w:ascii="Calibri" w:hAnsi="Calibri"/>
+          <w:b w:val="0"/>
+          <w:color w:val="1F2A2A"/>
+          <w:sz w:val="19"/>
+        </w:rPr>
+        <w:t xml:space="preserve"> – Aufgabe, Kontext, Material, Anforderungen, Ausgabeformat, Prüfkriterien.</w:t>
+      </w:r>
+    </w:p>
+    <w:p>
+      <w:pPr>
+        <w:pStyle w:val="MHChecklist"/>
+        <w:numPr>
+          <w:ilvl w:val="0"/>
+          <w:numId w:val="18"/>
+        </w:numPr>
+      </w:pPr>
+      <w:r>
+        <w:rPr>
+          <w:rFonts w:ascii="Calibri" w:hAnsi="Calibri"/>
+          <w:b/>
+          <w:color w:val="1F2A2A"/>
+          <w:sz w:val="19"/>
+        </w:rPr>
+        <w:t>Welche zwei Risiken kennen Sie?</w:t>
+      </w:r>
+      <w:r>
+        <w:rPr>
+          <w:rFonts w:ascii="Calibri" w:hAnsi="Calibri"/>
+          <w:b w:val="0"/>
+          <w:color w:val="1F2A2A"/>
+          <w:sz w:val="19"/>
+        </w:rPr>
+        <w:t xml:space="preserve"> – Zum Beispiel erfundene Fakten, veraltete Inhalte, falsche Quellen, Verzerrungen, Daten- oder Rechteprobleme.</w:t>
+      </w:r>
+    </w:p>
+    <w:p>
+      <w:pPr>
+        <w:pStyle w:val="MHChecklist"/>
+        <w:numPr>
+          <w:ilvl w:val="0"/>
+          <w:numId w:val="18"/>
+        </w:numPr>
+      </w:pPr>
+      <w:r>
+        <w:rPr>
+          <w:rFonts w:ascii="Calibri" w:hAnsi="Calibri"/>
+          <w:b/>
+          <w:color w:val="1F2A2A"/>
+          <w:sz w:val="19"/>
+        </w:rPr>
+        <w:t>Was gehört im Basistraining zu Rot?</w:t>
+      </w:r>
+      <w:r>
+        <w:rPr>
+          <w:rFonts w:ascii="Calibri" w:hAnsi="Calibri"/>
+          <w:b w:val="0"/>
+          <w:color w:val="1F2A2A"/>
+          <w:sz w:val="19"/>
+        </w:rPr>
+        <w:t xml:space="preserve"> – Besonders Zugangsdaten, Geheimnisse, sensible Personen-, Gesundheits- und Sicherheitsdaten.</w:t>
+      </w:r>
+    </w:p>
+    <w:p>
+      <w:pPr>
+        <w:pStyle w:val="MHChecklist"/>
+        <w:numPr>
+          <w:ilvl w:val="0"/>
+          <w:numId w:val="18"/>
+        </w:numPr>
+      </w:pPr>
+      <w:r>
+        <w:rPr>
+          <w:rFonts w:ascii="Calibri" w:hAnsi="Calibri"/>
+          <w:b/>
+          <w:color w:val="1F2A2A"/>
+          <w:sz w:val="19"/>
+        </w:rPr>
+        <w:t>Was bedeutet Gelb?</w:t>
+      </w:r>
+      <w:r>
+        <w:rPr>
+          <w:rFonts w:ascii="Calibri" w:hAnsi="Calibri"/>
+          <w:b w:val="0"/>
+          <w:color w:val="1F2A2A"/>
+          <w:sz w:val="19"/>
+        </w:rPr>
+        <w:t xml:space="preserve"> – Nicht eingeben; Werkzeug, Zweck, Daten und interne Freigabe zuerst klären.</w:t>
+      </w:r>
+    </w:p>
+    <w:p>
+      <w:pPr>
+        <w:pStyle w:val="MHChecklist"/>
+        <w:numPr>
+          <w:ilvl w:val="0"/>
+          <w:numId w:val="18"/>
+        </w:numPr>
+      </w:pPr>
+      <w:r>
+        <w:rPr>
+          <w:rFonts w:ascii="Calibri" w:hAnsi="Calibri"/>
+          <w:b/>
+          <w:color w:val="1F2A2A"/>
+          <w:sz w:val="19"/>
+        </w:rPr>
+        <w:t>Wer trägt Verantwortung für die Verwendung?</w:t>
+      </w:r>
+      <w:r>
+        <w:rPr>
+          <w:rFonts w:ascii="Calibri" w:hAnsi="Calibri"/>
+          <w:b w:val="0"/>
+          <w:color w:val="1F2A2A"/>
+          <w:sz w:val="19"/>
+        </w:rPr>
+        <w:t xml:space="preserve"> – Der zuständige Mensch beziehungsweise die festgelegte freigabeberechtigte Stelle.</w:t>
+      </w:r>
+    </w:p>
+    <w:p>
+      <w:pPr>
+        <w:pStyle w:val="MHChecklist"/>
+        <w:numPr>
+          <w:ilvl w:val="0"/>
+          <w:numId w:val="18"/>
+        </w:numPr>
+      </w:pPr>
+      <w:r>
+        <w:rPr>
+          <w:rFonts w:ascii="Calibri" w:hAnsi="Calibri"/>
+          <w:b/>
+          <w:color w:val="1F2A2A"/>
+          <w:sz w:val="19"/>
+        </w:rPr>
+        <w:t>Wie prüfen Sie Zahlen und Quellen?</w:t>
+      </w:r>
+      <w:r>
+        <w:rPr>
+          <w:rFonts w:ascii="Calibri" w:hAnsi="Calibri"/>
+          <w:b w:val="0"/>
+          <w:color w:val="1F2A2A"/>
+          <w:sz w:val="19"/>
+        </w:rPr>
+        <w:t xml:space="preserve"> – Mit belastbarer Originalquelle; Existenz, Aussage, Aktualität und Kontext prüfen.</w:t>
+      </w:r>
+    </w:p>
+    <w:p>
+      <w:pPr>
+        <w:pStyle w:val="MHChecklist"/>
+        <w:numPr>
+          <w:ilvl w:val="0"/>
+          <w:numId w:val="18"/>
+        </w:numPr>
+      </w:pPr>
+      <w:r>
+        <w:rPr>
+          <w:rFonts w:ascii="Calibri" w:hAnsi="Calibri"/>
+          <w:b/>
+          <w:color w:val="1F2A2A"/>
+          <w:sz w:val="19"/>
+        </w:rPr>
+        <w:t>Was tun bei erheblicher Wirkung auf eine Person?</w:t>
+      </w:r>
+      <w:r>
+        <w:rPr>
+          <w:rFonts w:ascii="Calibri" w:hAnsi="Calibri"/>
+          <w:b w:val="0"/>
+          <w:color w:val="1F2A2A"/>
+          <w:sz w:val="19"/>
+        </w:rPr>
+        <w:t xml:space="preserve"> – Stoppen, nicht automatisiert entscheiden und fachlich eskalieren.</w:t>
+      </w:r>
+    </w:p>
+    <w:p>
+      <w:pPr>
+        <w:pStyle w:val="MHChecklist"/>
+        <w:numPr>
+          <w:ilvl w:val="0"/>
+          <w:numId w:val="18"/>
+        </w:numPr>
+      </w:pPr>
+      <w:r>
+        <w:rPr>
+          <w:rFonts w:ascii="Calibri" w:hAnsi="Calibri"/>
+          <w:b/>
+          <w:color w:val="1F2A2A"/>
+          <w:sz w:val="19"/>
+        </w:rPr>
+        <w:t>Warum reicht ein privater Zugang nicht?</w:t>
+      </w:r>
+      <w:r>
+        <w:rPr>
+          <w:rFonts w:ascii="Calibri" w:hAnsi="Calibri"/>
+          <w:b w:val="0"/>
+          <w:color w:val="1F2A2A"/>
+          <w:sz w:val="19"/>
+        </w:rPr>
+        <w:t xml:space="preserve"> – Vertrag, Kontotyp, Einstellungen, Datenverwendung, Zugriffe und Unternehmensfreigabe sind entscheidend.</w:t>
+      </w:r>
+    </w:p>
+    <w:p>
+      <w:pPr>
+        <w:pStyle w:val="MHChecklist"/>
+        <w:numPr>
+          <w:ilvl w:val="0"/>
+          <w:numId w:val="18"/>
+        </w:numPr>
+      </w:pPr>
+      <w:r>
+        <w:rPr>
+          <w:rFonts w:ascii="Calibri" w:hAnsi="Calibri"/>
+          <w:b/>
+          <w:color w:val="1F2A2A"/>
+          <w:sz w:val="19"/>
+        </w:rPr>
+        <w:t>Wohin geht ein unklarer Fall?</w:t>
+      </w:r>
+      <w:r>
+        <w:rPr>
+          <w:rFonts w:ascii="Calibri" w:hAnsi="Calibri"/>
+          <w:b w:val="0"/>
+          <w:color w:val="1F2A2A"/>
+          <w:sz w:val="19"/>
+        </w:rPr>
+        <w:t xml:space="preserve"> – An die im Vorgespräch benannte interne Stelle, sonst an die verantwortliche Führungskraft.</w:t>
+      </w:r>
+    </w:p>
+    <w:p>
+      <w:pPr>
+        <w:pStyle w:val="Heading2"/>
+      </w:pPr>
+      <w:r>
+        <w:t>Verbindlicher Abschluss</w:t>
+      </w:r>
+    </w:p>
+    <w:p>
+      <w:pPr>
+        <w:pStyle w:val="MHChecklist"/>
+        <w:keepNext/>
+        <w:numPr>
+          <w:ilvl w:val="0"/>
+          <w:numId w:val="19"/>
+        </w:numPr>
+      </w:pPr>
+      <w:r>
+        <w:rPr>
+          <w:rFonts w:ascii="Calibri" w:hAnsi="Calibri"/>
+          <w:b w:val="0"/>
+          <w:color w:val="1F2A2A"/>
+          <w:sz w:val="19"/>
+        </w:rPr>
+        <w:t>Fünf betriebliche Grundregeln gemeinsam wiederholen.</w:t>
+      </w:r>
+    </w:p>
+    <w:p>
+      <w:pPr>
+        <w:pStyle w:val="MHChecklist"/>
+        <w:keepNext/>
+        <w:numPr>
+          <w:ilvl w:val="0"/>
+          <w:numId w:val="19"/>
+        </w:numPr>
+      </w:pPr>
+      <w:r>
+        <w:rPr>
+          <w:rFonts w:ascii="Calibri" w:hAnsi="Calibri"/>
+          <w:b w:val="0"/>
+          <w:color w:val="1F2A2A"/>
+          <w:sz w:val="19"/>
+        </w:rPr>
+        <w:t>Interne Ansprechpartner für Fachprüfung, Toolfreigabe, Datenschutz und Sicherheit eintragen lassen.</w:t>
+      </w:r>
+    </w:p>
+    <w:p>
+      <w:pPr>
+        <w:pStyle w:val="MHChecklist"/>
+        <w:keepNext/>
+        <w:numPr>
+          <w:ilvl w:val="0"/>
+          <w:numId w:val="19"/>
+        </w:numPr>
+      </w:pPr>
+      <w:r>
+        <w:rPr>
+          <w:rFonts w:ascii="Calibri" w:hAnsi="Calibri"/>
+          <w:b w:val="0"/>
+          <w:color w:val="1F2A2A"/>
+          <w:sz w:val="19"/>
+        </w:rPr>
+        <w:t>Pro Person einen kleinen, freigegebenen nächsten Anwendungsfall festhalten.</w:t>
+      </w:r>
+    </w:p>
+    <w:p>
+      <w:pPr>
+        <w:pStyle w:val="MHChecklist"/>
+        <w:keepNext/>
+        <w:numPr>
+          <w:ilvl w:val="0"/>
+          <w:numId w:val="19"/>
+        </w:numPr>
+      </w:pPr>
+      <w:r>
+        <w:rPr>
+          <w:rFonts w:ascii="Calibri" w:hAnsi="Calibri"/>
+          <w:b w:val="0"/>
+          <w:color w:val="1F2A2A"/>
+          <w:sz w:val="19"/>
+        </w:rPr>
+        <w:t>Auf Teilnehmerunterlagen und Management-Nachbesprechung hinweisen.</w:t>
+      </w:r>
+    </w:p>
+    <w:p>
+      <w:pPr>
+        <w:pStyle w:val="MHChecklist"/>
+        <w:keepNext w:val="0"/>
+        <w:numPr>
+          <w:ilvl w:val="0"/>
+          <w:numId w:val="19"/>
+        </w:numPr>
+      </w:pPr>
+      <w:r>
+        <w:rPr>
+          <w:rFonts w:ascii="Calibri" w:hAnsi="Calibri"/>
+          <w:b w:val="0"/>
+          <w:color w:val="1F2A2A"/>
+          <w:sz w:val="19"/>
+        </w:rPr>
+        <w:t>Danken und mit „Klein starten, sorgfältig prüfen, Verantwortung klar halten“ schließen.</w:t>
+      </w:r>
+    </w:p>
+    <w:p>
+      <w:pPr>
         <w:pStyle w:val="Heading1"/>
         <w:pageBreakBefore/>
       </w:pPr>
@@ -6344,7 +6756,7 @@
         <w:pStyle w:val="MHChecklist"/>
         <w:numPr>
           <w:ilvl w:val="0"/>
-          <w:numId w:val="18"/>
+          <w:numId w:val="20"/>
         </w:numPr>
       </w:pPr>
       <w:r>
@@ -6362,7 +6774,7 @@
         <w:pStyle w:val="MHChecklist"/>
         <w:numPr>
           <w:ilvl w:val="0"/>
-          <w:numId w:val="18"/>
+          <w:numId w:val="20"/>
         </w:numPr>
       </w:pPr>
       <w:r>
@@ -6380,7 +6792,7 @@
         <w:pStyle w:val="MHChecklist"/>
         <w:numPr>
           <w:ilvl w:val="0"/>
-          <w:numId w:val="18"/>
+          <w:numId w:val="20"/>
         </w:numPr>
       </w:pPr>
       <w:r>
@@ -6398,7 +6810,7 @@
         <w:pStyle w:val="MHChecklist"/>
         <w:numPr>
           <w:ilvl w:val="0"/>
-          <w:numId w:val="18"/>
+          <w:numId w:val="20"/>
         </w:numPr>
       </w:pPr>
       <w:r>
@@ -6416,7 +6828,7 @@
         <w:pStyle w:val="MHChecklist"/>
         <w:numPr>
           <w:ilvl w:val="0"/>
-          <w:numId w:val="18"/>
+          <w:numId w:val="20"/>
         </w:numPr>
       </w:pPr>
       <w:r>
@@ -6434,7 +6846,7 @@
         <w:pStyle w:val="MHChecklist"/>
         <w:numPr>
           <w:ilvl w:val="0"/>
-          <w:numId w:val="18"/>
+          <w:numId w:val="20"/>
         </w:numPr>
       </w:pPr>
       <w:r>
@@ -6452,7 +6864,7 @@
         <w:pStyle w:val="MHChecklist"/>
         <w:numPr>
           <w:ilvl w:val="0"/>
-          <w:numId w:val="18"/>
+          <w:numId w:val="20"/>
         </w:numPr>
       </w:pPr>
       <w:r>
@@ -6470,7 +6882,7 @@
         <w:pStyle w:val="MHChecklist"/>
         <w:numPr>
           <w:ilvl w:val="0"/>
-          <w:numId w:val="18"/>
+          <w:numId w:val="20"/>
         </w:numPr>
       </w:pPr>
       <w:r>
@@ -6488,7 +6900,7 @@
         <w:pStyle w:val="MHChecklist"/>
         <w:numPr>
           <w:ilvl w:val="0"/>
-          <w:numId w:val="18"/>
+          <w:numId w:val="20"/>
         </w:numPr>
       </w:pPr>
       <w:r>
@@ -6506,7 +6918,7 @@
         <w:pStyle w:val="MHChecklist"/>
         <w:numPr>
           <w:ilvl w:val="0"/>
-          <w:numId w:val="18"/>
+          <w:numId w:val="20"/>
         </w:numPr>
       </w:pPr>
       <w:r>
@@ -6524,7 +6936,7 @@
         <w:pStyle w:val="MHChecklist"/>
         <w:numPr>
           <w:ilvl w:val="0"/>
-          <w:numId w:val="18"/>
+          <w:numId w:val="20"/>
         </w:numPr>
       </w:pPr>
       <w:r>
@@ -6542,7 +6954,7 @@
         <w:pStyle w:val="MHChecklist"/>
         <w:numPr>
           <w:ilvl w:val="0"/>
-          <w:numId w:val="18"/>
+          <w:numId w:val="20"/>
         </w:numPr>
       </w:pPr>
       <w:r>
@@ -6560,7 +6972,7 @@
         <w:pStyle w:val="MHChecklist"/>
         <w:numPr>
           <w:ilvl w:val="0"/>
-          <w:numId w:val="18"/>
+          <w:numId w:val="20"/>
         </w:numPr>
       </w:pPr>
       <w:r>
@@ -7007,6 +7419,18 @@
     </w:lvlOverride>
   </w:num>
   <w:num w:numId="18">
+    <w:abstractNumId w:val="10"/>
+    <w:lvlOverride w:ilvl="0">
+      <w:startOverride w:val="1"/>
+    </w:lvlOverride>
+  </w:num>
+  <w:num w:numId="19">
+    <w:abstractNumId w:val="10"/>
+    <w:lvlOverride w:ilvl="0">
+      <w:startOverride w:val="1"/>
+    </w:lvlOverride>
+  </w:num>
+  <w:num w:numId="20">
     <w:abstractNumId w:val="11"/>
     <w:lvlOverride w:ilvl="0">
       <w:startOverride w:val="1"/>

</xml_diff>

<commit_message>
fix: complete AI-Startklar package metadata
</commit_message>
<xml_diff>
--- a/deliverables/ai-startklar/schulung/07-trainerleitfaden.docx
+++ b/deliverables/ai-startklar/schulung/07-trainerleitfaden.docx
@@ -396,7 +396,7 @@
           <w:color w:val="1F2A2A"/>
           <w:sz w:val="19"/>
         </w:rPr>
-        <w:t>Ausgewählter Praxisfall festgelegt; Basis- oder Fortgeschrittenenstufe entschieden.</w:t>
+        <w:t>Kurzfall A für Modul 4/Folien 21–22 im gewählten Fokus festgelegt.</w:t>
       </w:r>
     </w:p>
     <w:p>
@@ -414,7 +414,7 @@
           <w:color w:val="1F2A2A"/>
           <w:sz w:val="19"/>
         </w:rPr>
-        <w:t>Praxisfall, Beispielausgabe und Ersatzmaterial ausschließlich synthetisch geprüft.</w:t>
+        <w:t>Hauptfall B für Modul 6–7 im selben oder vereinbarten Fokus; beide Beispiele ausschließlich synthetisch geprüft.</w:t>
       </w:r>
     </w:p>
     <w:p>
@@ -1066,7 +1066,7 @@
                 <w:color w:val="1F2A2A"/>
                 <w:sz w:val="18"/>
               </w:rPr>
-              <w:t>Gute Prompts</w:t>
+              <w:t>Kurzfall A: Prompt verbessern und kritisieren</w:t>
             </w:r>
           </w:p>
         </w:tc>
@@ -1348,7 +1348,7 @@
                 <w:color w:val="1F2A2A"/>
                 <w:sz w:val="18"/>
               </w:rPr>
-              <w:t>Unternehmensbezogene Praxisübung</w:t>
+              <w:t>Hauptfall B: Unternehmensbezogene Praxisübung</w:t>
             </w:r>
           </w:p>
         </w:tc>
@@ -1442,7 +1442,7 @@
                 <w:color w:val="1F2A2A"/>
                 <w:sz w:val="18"/>
               </w:rPr>
-              <w:t>Prüfen, verbessern und freigeben</w:t>
+              <w:t>Hauptfall B prüfen, verbessern und freigeben</w:t>
             </w:r>
           </w:p>
         </w:tc>
@@ -3093,6 +3093,29 @@
       <w:pPr>
         <w:spacing w:after="40"/>
       </w:pPr>
+    </w:p>
+    <w:p>
+      <w:pPr>
+        <w:pStyle w:val="MHCompact"/>
+      </w:pPr>
+      <w:r>
+        <w:rPr>
+          <w:rFonts w:ascii="Calibri" w:hAnsi="Calibri"/>
+          <w:b/>
+          <w:color w:val="163F9E"/>
+          <w:sz w:val="20"/>
+        </w:rPr>
+        <w:t xml:space="preserve">Praxisbeispiel: </w:t>
+      </w:r>
+      <w:r>
+        <w:rPr>
+          <w:rFonts w:ascii="Calibri" w:hAnsi="Calibri"/>
+          <w:b w:val="0"/>
+          <w:color w:val="1F2A2A"/>
+          <w:sz w:val="20"/>
+        </w:rPr>
+        <w:t>Kurzfall A wird in Modul 4 auf den Folien 21–22 als vorbereiteter synthetischer Fokusfall genutzt: zuerst den schwachen Prompt verbessern, danach die vorbereitete Ausgabe kritisieren und gezielt überarbeiten.</w:t>
+      </w:r>
     </w:p>
     <w:p>
       <w:pPr/>
@@ -4315,6 +4338,29 @@
       </w:pPr>
     </w:p>
     <w:p>
+      <w:pPr>
+        <w:pStyle w:val="MHCompact"/>
+      </w:pPr>
+      <w:r>
+        <w:rPr>
+          <w:rFonts w:ascii="Calibri" w:hAnsi="Calibri"/>
+          <w:b/>
+          <w:color w:val="163F9E"/>
+          <w:sz w:val="20"/>
+        </w:rPr>
+        <w:t xml:space="preserve">Praxisbeispiel: </w:t>
+      </w:r>
+      <w:r>
+        <w:rPr>
+          <w:rFonts w:ascii="Calibri" w:hAnsi="Calibri"/>
+          <w:b w:val="0"/>
+          <w:color w:val="1F2A2A"/>
+          <w:sz w:val="20"/>
+        </w:rPr>
+        <w:t>Hauptfall B wird im vereinbarten Fokus in Modul 6–7 vollständig bearbeitet: Ziel und Daten einordnen, Prompt formulieren, Ausgabe prüfen, verbessern und den menschlichen Freigabeweg festlegen.</w:t>
+      </w:r>
+    </w:p>
+    <w:p>
       <w:pPr/>
       <w:r>
         <w:rPr>
@@ -5925,7 +5971,7 @@
                 <w:color w:val="1F2A2A"/>
                 <w:sz w:val="21"/>
               </w:rPr>
-              <w:t>Auswahlweg: Ziel des Vorgesprächs prüfen → passendsten Arbeitsprozess wählen → Basis oder Fortgeschritten festlegen → ausschließlich die synthetische Fallmappe verwenden → menschlichen Prüf- und Freigabeweg vorab benennen.</w:t>
+              <w:t>Zwei vorbereitete Übungen im vereinbarten Fokus: Kurzfall A wird in Modul 4/Folien 21–22 zum Verbessern und Kritisieren eines Prompts genutzt. Hauptfall B wird in Modul 6–7 vollständig bearbeitet und geprüft. Beide bleiben synthetisch; es entsteht kein Zusatz-Timing.</w:t>
             </w:r>
           </w:p>
         </w:tc>
@@ -6748,241 +6794,15 @@
           <w:color w:val="1F2A2A"/>
           <w:sz w:val="20"/>
         </w:rPr>
-        <w:t>Diese eine Seite vollständig bearbeiten und in der vereinbarten Kundenablage dokumentieren.</w:t>
+        <w:t>Einseitiges Schulungsdokumentationsblatt vollständig ausfüllen und in der vereinbarten Kundenablage dokumentieren.</w:t>
       </w:r>
     </w:p>
     <w:p>
       <w:pPr>
-        <w:pStyle w:val="MHChecklist"/>
-        <w:numPr>
-          <w:ilvl w:val="0"/>
-          <w:numId w:val="20"/>
-        </w:numPr>
+        <w:pStyle w:val="Heading2"/>
       </w:pPr>
       <w:r>
-        <w:rPr>
-          <w:rFonts w:ascii="Calibri" w:hAnsi="Calibri"/>
-          <w:b w:val="0"/>
-          <w:color w:val="1F2A2A"/>
-          <w:sz w:val="19"/>
-        </w:rPr>
-        <w:t>Datum, Uhrzeit, Kunde, Format, Trainer und tatsächliche Dauer dokumentiert.</w:t>
-      </w:r>
-    </w:p>
-    <w:p>
-      <w:pPr>
-        <w:pStyle w:val="MHChecklist"/>
-        <w:numPr>
-          <w:ilvl w:val="0"/>
-          <w:numId w:val="20"/>
-        </w:numPr>
-      </w:pPr>
-      <w:r>
-        <w:rPr>
-          <w:rFonts w:ascii="Calibri" w:hAnsi="Calibri"/>
-          <w:b w:val="0"/>
-          <w:color w:val="1F2A2A"/>
-          <w:sz w:val="19"/>
-        </w:rPr>
-        <w:t>Teilnehmendenzahl und verwendete Agenda festgehalten; Teilnahmeliste getrennt geschützt abgelegt.</w:t>
-      </w:r>
-    </w:p>
-    <w:p>
-      <w:pPr>
-        <w:pStyle w:val="MHChecklist"/>
-        <w:numPr>
-          <w:ilvl w:val="0"/>
-          <w:numId w:val="20"/>
-        </w:numPr>
-      </w:pPr>
-      <w:r>
-        <w:rPr>
-          <w:rFonts w:ascii="Calibri" w:hAnsi="Calibri"/>
-          <w:b w:val="0"/>
-          <w:color w:val="1F2A2A"/>
-          <w:sz w:val="19"/>
-        </w:rPr>
-        <w:t>Verwendeter Praxisfall und Stufe (Basis/Fortgeschritten) notiert.</w:t>
-      </w:r>
-    </w:p>
-    <w:p>
-      <w:pPr>
-        <w:pStyle w:val="MHChecklist"/>
-        <w:numPr>
-          <w:ilvl w:val="0"/>
-          <w:numId w:val="20"/>
-        </w:numPr>
-      </w:pPr>
-      <w:r>
-        <w:rPr>
-          <w:rFonts w:ascii="Calibri" w:hAnsi="Calibri"/>
-          <w:b w:val="0"/>
-          <w:color w:val="1F2A2A"/>
-          <w:sz w:val="19"/>
-        </w:rPr>
-        <w:t>Verwendetes Werkzeug/Konto oder Offline-Durchführung dokumentiert.</w:t>
-      </w:r>
-    </w:p>
-    <w:p>
-      <w:pPr>
-        <w:pStyle w:val="MHChecklist"/>
-        <w:numPr>
-          <w:ilvl w:val="0"/>
-          <w:numId w:val="20"/>
-        </w:numPr>
-      </w:pPr>
-      <w:r>
-        <w:rPr>
-          <w:rFonts w:ascii="Calibri" w:hAnsi="Calibri"/>
-          <w:b w:val="0"/>
-          <w:color w:val="1F2A2A"/>
-          <w:sz w:val="19"/>
-        </w:rPr>
-        <w:t>Bestätigt: Es wurden nur synthetische oder zulässig anonymisierte Übungsdaten verwendet.</w:t>
-      </w:r>
-    </w:p>
-    <w:p>
-      <w:pPr>
-        <w:pStyle w:val="MHChecklist"/>
-        <w:numPr>
-          <w:ilvl w:val="0"/>
-          <w:numId w:val="20"/>
-        </w:numPr>
-      </w:pPr>
-      <w:r>
-        <w:rPr>
-          <w:rFonts w:ascii="Calibri" w:hAnsi="Calibri"/>
-          <w:b w:val="0"/>
-          <w:color w:val="1F2A2A"/>
-          <w:sz w:val="19"/>
-        </w:rPr>
-        <w:t>Abweichungen, Safety Stops und ungeklärte Daten-/Toolfragen ohne sensible Inhalte beschrieben.</w:t>
-      </w:r>
-    </w:p>
-    <w:p>
-      <w:pPr>
-        <w:pStyle w:val="MHChecklist"/>
-        <w:numPr>
-          <w:ilvl w:val="0"/>
-          <w:numId w:val="20"/>
-        </w:numPr>
-      </w:pPr>
-      <w:r>
-        <w:rPr>
-          <w:rFonts w:ascii="Calibri" w:hAnsi="Calibri"/>
-          <w:b w:val="0"/>
-          <w:color w:val="1F2A2A"/>
-          <w:sz w:val="19"/>
-        </w:rPr>
-        <w:t>Genannte interne Rollen für Fachprüfung, Toolfreigabe, Datenschutz, Sicherheit und Eskalation notiert.</w:t>
-      </w:r>
-    </w:p>
-    <w:p>
-      <w:pPr>
-        <w:pStyle w:val="MHChecklist"/>
-        <w:numPr>
-          <w:ilvl w:val="0"/>
-          <w:numId w:val="20"/>
-        </w:numPr>
-      </w:pPr>
-      <w:r>
-        <w:rPr>
-          <w:rFonts w:ascii="Calibri" w:hAnsi="Calibri"/>
-          <w:b w:val="0"/>
-          <w:color w:val="1F2A2A"/>
-          <w:sz w:val="19"/>
-        </w:rPr>
-        <w:t>Lerncheck durchgeführt; häufige Missverständnisse und geklärte Punkte zusammengefasst.</w:t>
-      </w:r>
-    </w:p>
-    <w:p>
-      <w:pPr>
-        <w:pStyle w:val="MHChecklist"/>
-        <w:numPr>
-          <w:ilvl w:val="0"/>
-          <w:numId w:val="20"/>
-        </w:numPr>
-      </w:pPr>
-      <w:r>
-        <w:rPr>
-          <w:rFonts w:ascii="Calibri" w:hAnsi="Calibri"/>
-          <w:b w:val="0"/>
-          <w:color w:val="1F2A2A"/>
-          <w:sz w:val="19"/>
-        </w:rPr>
-        <w:t>Offene Fragen mit Verantwortlichem und Zieltermin in den Nachgang überführt.</w:t>
-      </w:r>
-    </w:p>
-    <w:p>
-      <w:pPr>
-        <w:pStyle w:val="MHChecklist"/>
-        <w:numPr>
-          <w:ilvl w:val="0"/>
-          <w:numId w:val="20"/>
-        </w:numPr>
-      </w:pPr>
-      <w:r>
-        <w:rPr>
-          <w:rFonts w:ascii="Calibri" w:hAnsi="Calibri"/>
-          <w:b w:val="0"/>
-          <w:color w:val="1F2A2A"/>
-          <w:sz w:val="19"/>
-        </w:rPr>
-        <w:t>Teilnehmerunterlagen übergeben; Trainerunterlagen und Antwortmaterial nicht versehentlich verteilt.</w:t>
-      </w:r>
-    </w:p>
-    <w:p>
-      <w:pPr>
-        <w:pStyle w:val="MHChecklist"/>
-        <w:numPr>
-          <w:ilvl w:val="0"/>
-          <w:numId w:val="20"/>
-        </w:numPr>
-      </w:pPr>
-      <w:r>
-        <w:rPr>
-          <w:rFonts w:ascii="Calibri" w:hAnsi="Calibri"/>
-          <w:b w:val="0"/>
-          <w:color w:val="1F2A2A"/>
-          <w:sz w:val="19"/>
-        </w:rPr>
-        <w:t>Management-Follow-up innerhalb des vereinbarten Rahmens terminiert.</w:t>
-      </w:r>
-    </w:p>
-    <w:p>
-      <w:pPr>
-        <w:pStyle w:val="MHChecklist"/>
-        <w:numPr>
-          <w:ilvl w:val="0"/>
-          <w:numId w:val="20"/>
-        </w:numPr>
-      </w:pPr>
-      <w:r>
-        <w:rPr>
-          <w:rFonts w:ascii="Calibri" w:hAnsi="Calibri"/>
-          <w:b w:val="0"/>
-          <w:color w:val="1F2A2A"/>
-          <w:sz w:val="19"/>
-        </w:rPr>
-        <w:t>Keine Aussage als Rechts-, Datenschutz-, Sicherheits-, Tool- oder Compliance-Freigabe dokumentiert.</w:t>
-      </w:r>
-    </w:p>
-    <w:p>
-      <w:pPr>
-        <w:pStyle w:val="MHChecklist"/>
-        <w:numPr>
-          <w:ilvl w:val="0"/>
-          <w:numId w:val="20"/>
-        </w:numPr>
-      </w:pPr>
-      <w:r>
-        <w:rPr>
-          <w:rFonts w:ascii="Calibri" w:hAnsi="Calibri"/>
-          <w:b w:val="0"/>
-          <w:color w:val="1F2A2A"/>
-          <w:sz w:val="19"/>
-        </w:rPr>
-        <w:t>Ablage, Zugriff und Aufbewahrung nach Kundenprozess bestätigt.</w:t>
+        <w:t>Durchführung und Lieferumfang</w:t>
       </w:r>
     </w:p>
     <w:p>
@@ -6996,7 +6816,7 @@
           <w:color w:val="163F9E"/>
           <w:sz w:val="20"/>
         </w:rPr>
-        <w:t xml:space="preserve">Abweichung / offener Nachgang: </w:t>
+        <w:t xml:space="preserve">Kunde / Kontakt: </w:t>
       </w:r>
       <w:r>
         <w:rPr>
@@ -7019,7 +6839,7 @@
           <w:color w:val="163F9E"/>
           <w:sz w:val="20"/>
         </w:rPr>
-        <w:t xml:space="preserve">Verantwortlich / Termin: </w:t>
+        <w:t xml:space="preserve">Datum / Format / Trainer / tatsächliche Dauer: </w:t>
       </w:r>
       <w:r>
         <w:rPr>
@@ -7028,7 +6848,266 @@
           <w:color w:val="1F2A2A"/>
           <w:sz w:val="20"/>
         </w:rPr>
-        <w:t>____________________________________________________________</w:t>
+        <w:t>________________________________________</w:t>
+      </w:r>
+    </w:p>
+    <w:p>
+      <w:pPr>
+        <w:pStyle w:val="MHCompact"/>
+      </w:pPr>
+      <w:r>
+        <w:rPr>
+          <w:rFonts w:ascii="Calibri" w:hAnsi="Calibri"/>
+          <w:b/>
+          <w:color w:val="163F9E"/>
+          <w:sz w:val="20"/>
+        </w:rPr>
+        <w:t xml:space="preserve">Zielgruppe / Rollen: </w:t>
+      </w:r>
+      <w:r>
+        <w:rPr>
+          <w:rFonts w:ascii="Calibri" w:hAnsi="Calibri"/>
+          <w:b w:val="0"/>
+          <w:color w:val="1F2A2A"/>
+          <w:sz w:val="20"/>
+        </w:rPr>
+        <w:t>________________________________________________________</w:t>
+      </w:r>
+    </w:p>
+    <w:p>
+      <w:pPr>
+        <w:pStyle w:val="MHCompact"/>
+      </w:pPr>
+      <w:r>
+        <w:rPr>
+          <w:rFonts w:ascii="Calibri" w:hAnsi="Calibri"/>
+          <w:b/>
+          <w:color w:val="163F9E"/>
+          <w:sz w:val="20"/>
+        </w:rPr>
+        <w:t xml:space="preserve">Werkzeug / Konto / Offline: </w:t>
+      </w:r>
+      <w:r>
+        <w:rPr>
+          <w:rFonts w:ascii="Calibri" w:hAnsi="Calibri"/>
+          <w:b w:val="0"/>
+          <w:color w:val="1F2A2A"/>
+          <w:sz w:val="20"/>
+        </w:rPr>
+        <w:t>___________________________________________________</w:t>
+      </w:r>
+    </w:p>
+    <w:p>
+      <w:pPr>
+        <w:pStyle w:val="MHCompact"/>
+      </w:pPr>
+      <w:r>
+        <w:rPr>
+          <w:rFonts w:ascii="Calibri" w:hAnsi="Calibri"/>
+          <w:b/>
+          <w:color w:val="163F9E"/>
+          <w:sz w:val="20"/>
+        </w:rPr>
+        <w:t xml:space="preserve">Behandelte Module: </w:t>
+      </w:r>
+      <w:r>
+        <w:rPr>
+          <w:rFonts w:ascii="Calibri" w:hAnsi="Calibri"/>
+          <w:b w:val="0"/>
+          <w:color w:val="1F2A2A"/>
+          <w:sz w:val="20"/>
+        </w:rPr>
+        <w:t>☐ 1  ☐ 2  ☐ 3  ☐ 4  ☐ 5  ☐ 6  ☐ 7  ☐ 8</w:t>
+      </w:r>
+    </w:p>
+    <w:p>
+      <w:pPr>
+        <w:pStyle w:val="MHCompact"/>
+      </w:pPr>
+      <w:r>
+        <w:rPr>
+          <w:rFonts w:ascii="Calibri" w:hAnsi="Calibri"/>
+          <w:b/>
+          <w:color w:val="163F9E"/>
+          <w:sz w:val="20"/>
+        </w:rPr>
+        <w:t xml:space="preserve">Praxisfall / synthetisch: </w:t>
+      </w:r>
+      <w:r>
+        <w:rPr>
+          <w:rFonts w:ascii="Calibri" w:hAnsi="Calibri"/>
+          <w:b w:val="0"/>
+          <w:color w:val="1F2A2A"/>
+          <w:sz w:val="20"/>
+        </w:rPr>
+        <w:t>Kurzfall A: ______________  Hauptfall B: ______________  ☐ synthetisch bestätigt</w:t>
+      </w:r>
+    </w:p>
+    <w:p>
+      <w:pPr>
+        <w:pStyle w:val="MHCompact"/>
+      </w:pPr>
+      <w:r>
+        <w:rPr>
+          <w:rFonts w:ascii="Calibri" w:hAnsi="Calibri"/>
+          <w:b/>
+          <w:color w:val="163F9E"/>
+          <w:sz w:val="20"/>
+        </w:rPr>
+        <w:t xml:space="preserve">Ausgegebene Unterlagen: </w:t>
+      </w:r>
+      <w:r>
+        <w:rPr>
+          <w:rFonts w:ascii="Calibri" w:hAnsi="Calibri"/>
+          <w:b w:val="0"/>
+          <w:color w:val="1F2A2A"/>
+          <w:sz w:val="20"/>
+        </w:rPr>
+        <w:t>____________________________________________________</w:t>
+      </w:r>
+    </w:p>
+    <w:p>
+      <w:pPr>
+        <w:pStyle w:val="MHCompact"/>
+      </w:pPr>
+      <w:r>
+        <w:rPr>
+          <w:rFonts w:ascii="Calibri" w:hAnsi="Calibri"/>
+          <w:b/>
+          <w:color w:val="163F9E"/>
+          <w:sz w:val="20"/>
+        </w:rPr>
+        <w:t xml:space="preserve">Offene Punkte / Folgemaßnahmen: </w:t>
+      </w:r>
+      <w:r>
+        <w:rPr>
+          <w:rFonts w:ascii="Calibri" w:hAnsi="Calibri"/>
+          <w:b w:val="0"/>
+          <w:color w:val="1F2A2A"/>
+          <w:sz w:val="20"/>
+        </w:rPr>
+        <w:t>_______________________________________________</w:t>
+      </w:r>
+    </w:p>
+    <w:p>
+      <w:pPr>
+        <w:pStyle w:val="Heading2"/>
+      </w:pPr>
+      <w:r>
+        <w:t>Kompakte Nachdoku-Checks</w:t>
+      </w:r>
+    </w:p>
+    <w:p>
+      <w:pPr>
+        <w:pStyle w:val="MHChecklist"/>
+        <w:numPr>
+          <w:ilvl w:val="0"/>
+          <w:numId w:val="20"/>
+        </w:numPr>
+      </w:pPr>
+      <w:r>
+        <w:rPr>
+          <w:rFonts w:ascii="Calibri" w:hAnsi="Calibri"/>
+          <w:b w:val="0"/>
+          <w:color w:val="1F2A2A"/>
+          <w:sz w:val="19"/>
+        </w:rPr>
+        <w:t>Teilnahmeliste getrennt und geschützt abgelegt; Rollen und tatsächliche Dauer dokumentiert.</w:t>
+      </w:r>
+    </w:p>
+    <w:p>
+      <w:pPr>
+        <w:pStyle w:val="MHChecklist"/>
+        <w:numPr>
+          <w:ilvl w:val="0"/>
+          <w:numId w:val="20"/>
+        </w:numPr>
+      </w:pPr>
+      <w:r>
+        <w:rPr>
+          <w:rFonts w:ascii="Calibri" w:hAnsi="Calibri"/>
+          <w:b w:val="0"/>
+          <w:color w:val="1F2A2A"/>
+          <w:sz w:val="19"/>
+        </w:rPr>
+        <w:t>Kurzfall A und Hauptfall B ausschließlich synthetisch durchgeführt; Safety Stops und Abweichungen ohne sensible Inhalte festgehalten.</w:t>
+      </w:r>
+    </w:p>
+    <w:p>
+      <w:pPr>
+        <w:pStyle w:val="MHChecklist"/>
+        <w:numPr>
+          <w:ilvl w:val="0"/>
+          <w:numId w:val="20"/>
+        </w:numPr>
+      </w:pPr>
+      <w:r>
+        <w:rPr>
+          <w:rFonts w:ascii="Calibri" w:hAnsi="Calibri"/>
+          <w:b w:val="0"/>
+          <w:color w:val="1F2A2A"/>
+          <w:sz w:val="19"/>
+        </w:rPr>
+        <w:t>Lerncheck und häufige Missverständnisse dokumentiert; Trainerantworten nicht an Teilnehmende verteilt.</w:t>
+      </w:r>
+    </w:p>
+    <w:p>
+      <w:pPr>
+        <w:pStyle w:val="MHChecklist"/>
+        <w:numPr>
+          <w:ilvl w:val="0"/>
+          <w:numId w:val="20"/>
+        </w:numPr>
+      </w:pPr>
+      <w:r>
+        <w:rPr>
+          <w:rFonts w:ascii="Calibri" w:hAnsi="Calibri"/>
+          <w:b w:val="0"/>
+          <w:color w:val="1F2A2A"/>
+          <w:sz w:val="19"/>
+        </w:rPr>
+        <w:t>Offene Punkte mit Verantwortlichem und Zieltermin in Folgemaßnahmen überführt.</w:t>
+      </w:r>
+    </w:p>
+    <w:p>
+      <w:pPr>
+        <w:pStyle w:val="MHChecklist"/>
+        <w:numPr>
+          <w:ilvl w:val="0"/>
+          <w:numId w:val="20"/>
+        </w:numPr>
+      </w:pPr>
+      <w:r>
+        <w:rPr>
+          <w:rFonts w:ascii="Calibri" w:hAnsi="Calibri"/>
+          <w:b w:val="0"/>
+          <w:color w:val="1F2A2A"/>
+          <w:sz w:val="19"/>
+        </w:rPr>
+        <w:t>Keine Rechts-, Datenschutz-, Sicherheits-, Tool- oder Compliance-Freigabe behauptet; Ablage nach Kundenprozess bestätigt.</w:t>
+      </w:r>
+    </w:p>
+    <w:p>
+      <w:pPr>
+        <w:pStyle w:val="MHCompact"/>
+      </w:pPr>
+      <w:r>
+        <w:rPr>
+          <w:rFonts w:ascii="Calibri" w:hAnsi="Calibri"/>
+          <w:b/>
+          <w:color w:val="163F9E"/>
+          <w:sz w:val="20"/>
+        </w:rPr>
+        <w:t xml:space="preserve">Verantwortlich / Zieltermin: </w:t>
+      </w:r>
+      <w:r>
+        <w:rPr>
+          <w:rFonts w:ascii="Calibri" w:hAnsi="Calibri"/>
+          <w:b w:val="0"/>
+          <w:color w:val="1F2A2A"/>
+          <w:sz w:val="20"/>
+        </w:rPr>
+        <w:t>_________________________________________________</w:t>
       </w:r>
     </w:p>
     <w:p>
@@ -7080,7 +7159,7 @@
         <w:color w:val="5A5E55"/>
         <w:sz w:val="17"/>
       </w:rPr>
-      <w:t xml:space="preserve">MyHiwi AI-Startklar  ·  </w:t>
+      <w:t xml:space="preserve">MyHiwi AI-Startklar  ·  Version 1.0  ·  Stand 22. Juli 2026  ·  </w:t>
     </w:r>
     <w:r>
       <w:rPr>

</xml_diff>

<commit_message>
fix: adapt AI-Startklar exercises to focus
</commit_message>
<xml_diff>
--- a/deliverables/ai-startklar/schulung/07-trainerleitfaden.docx
+++ b/deliverables/ai-startklar/schulung/07-trainerleitfaden.docx
@@ -3309,7 +3309,7 @@
           <w:b w:val="0"/>
           <w:color w:val="1F2A2A"/>
         </w:rPr>
-        <w:t>Paare verbessern den Prompt „Schreib eine Antwort an den Kunden“ für eine synthetische Anfrage. Basisgruppen füllen die sechs Felder. Fortgeschrittene prüfen eine vorbereitete Ausgabe selbst, fordern anschließend Kritik an und entscheiden, welche Verbesserungen sie übernehmen.</w:t>
+        <w:t>Paare verbessern den vorbereiteten schwachen Startprompt aus Kurzfall A im gewählten Praxisfokus. Basisgruppen füllen die sechs Felder. Fortgeschrittene prüfen eine vorbereitete Ausgabe selbst, fordern anschließend Kritik an und entscheiden, welche Verbesserungen sie übernehmen.</w:t>
       </w:r>
     </w:p>
     <w:p>
@@ -3485,7 +3485,7 @@
                 <w:color w:val="1F2A2A"/>
                 <w:sz w:val="21"/>
               </w:rPr>
-              <w:t>Es wird ausschließlich die ausgegebene synthetische Kundenanfrage verwendet. Niemand ersetzt Platzhalter spontan durch echte Namen, Vorgänge oder interne Angaben.</w:t>
+              <w:t>Es wird ausschließlich das ausgegebene synthetische Material aus Kurzfall A verwendet. Niemand ersetzt Platzhalter spontan durch echte Namen, Vorgänge oder interne Angaben.</w:t>
             </w:r>
           </w:p>
         </w:tc>

</xml_diff>